<commit_message>
Fix Model A & C routing, student types, and semester string matching
</commit_message>
<xml_diff>
--- a/Literature review.docx
+++ b/Literature review.docx
@@ -1,6 +1,6 @@
 
 <file path=word/document.xml><?xml version="1.0" encoding="utf-8"?>
-<w:document xmlns:wpc="http://schemas.microsoft.com/office/word/2010/wordprocessingCanvas" xmlns:cx="http://schemas.microsoft.com/office/drawing/2014/chartex" xmlns:cx1="http://schemas.microsoft.com/office/drawing/2015/9/8/chartex" xmlns:cx2="http://schemas.microsoft.com/office/drawing/2015/10/21/chartex" xmlns:cx3="http://schemas.microsoft.com/office/drawing/2016/5/9/chartex" xmlns:cx4="http://schemas.microsoft.com/office/drawing/2016/5/10/chartex" xmlns:cx5="http://schemas.microsoft.com/office/drawing/2016/5/11/chartex" xmlns:cx6="http://schemas.microsoft.com/office/drawing/2016/5/12/chartex" xmlns:cx7="http://schemas.microsoft.com/office/drawing/2016/5/13/chartex" xmlns:cx8="http://schemas.microsoft.com/office/drawing/2016/5/14/chartex" xmlns:mc="http://schemas.openxmlformats.org/markup-compatibility/2006" xmlns:aink="http://schemas.microsoft.com/office/drawing/2016/ink" xmlns:am3d="http://schemas.microsoft.com/office/drawing/2017/model3d" xmlns:o="urn:schemas-microsoft-com:office:office" xmlns:oel="http://schemas.microsoft.com/office/2019/extlst" xmlns:r="http://schemas.openxmlformats.org/officeDocument/2006/relationships" xmlns:m="http://schemas.openxmlformats.org/officeDocument/2006/math" xmlns:v="urn:schemas-microsoft-com:vml" xmlns:wp14="http://schemas.microsoft.com/office/word/2010/wordprocessingDrawing" xmlns:wp="http://schemas.openxmlformats.org/drawingml/2006/wordprocessingDrawing" xmlns:w10="urn:schemas-microsoft-com:office:word" xmlns:w="http://schemas.openxmlformats.org/wordprocessingml/2006/main" xmlns:w14="http://schemas.microsoft.com/office/word/2010/wordml" xmlns:w15="http://schemas.microsoft.com/office/word/2012/wordml" xmlns:w16cex="http://schemas.microsoft.com/office/word/2018/wordml/cex" xmlns:w16cid="http://schemas.microsoft.com/office/word/2016/wordml/cid" xmlns:w16="http://schemas.microsoft.com/office/word/2018/wordml" xmlns:w16du="http://schemas.microsoft.com/office/word/2023/wordml/word16du" xmlns:w16sdtdh="http://schemas.microsoft.com/office/word/2020/wordml/sdtdatahash" xmlns:w16sdtfl="http://schemas.microsoft.com/office/word/2024/wordml/sdtformatlock" xmlns:w16se="http://schemas.microsoft.com/office/word/2015/wordml/symex" xmlns:wpg="http://schemas.microsoft.com/office/word/2010/wordprocessingGroup" xmlns:wpi="http://schemas.microsoft.com/office/word/2010/wordprocessingInk" xmlns:wne="http://schemas.microsoft.com/office/word/2006/wordml" xmlns:wps="http://schemas.microsoft.com/office/word/2010/wordprocessingShape" mc:Ignorable="w14 w15 w16se w16cid w16 w16cex w16sdtdh w16sdtfl w16du wp14">
+<w:document xmlns:wpc="http://schemas.microsoft.com/office/word/2010/wordprocessingCanvas" xmlns:cx="http://schemas.microsoft.com/office/drawing/2014/chartex" xmlns:cx1="http://schemas.microsoft.com/office/drawing/2015/9/8/chartex" xmlns:cx2="http://schemas.microsoft.com/office/drawing/2015/10/21/chartex" xmlns:cx3="http://schemas.microsoft.com/office/drawing/2016/5/9/chartex" xmlns:cx4="http://schemas.microsoft.com/office/drawing/2016/5/10/chartex" xmlns:cx5="http://schemas.microsoft.com/office/drawing/2016/5/11/chartex" xmlns:cx6="http://schemas.microsoft.com/office/drawing/2016/5/12/chartex" xmlns:cx7="http://schemas.microsoft.com/office/drawing/2016/5/13/chartex" xmlns:cx8="http://schemas.microsoft.com/office/drawing/2016/5/14/chartex" xmlns:mc="http://schemas.openxmlformats.org/markup-compatibility/2006" xmlns:aink="http://schemas.microsoft.com/office/drawing/2016/ink" xmlns:am3d="http://schemas.microsoft.com/office/drawing/2017/model3d" xmlns:o="urn:schemas-microsoft-com:office:office" xmlns:oel="http://schemas.microsoft.com/office/2019/extlst" xmlns:r="http://schemas.openxmlformats.org/officeDocument/2006/relationships" xmlns:m="http://schemas.openxmlformats.org/officeDocument/2006/math" xmlns:v="urn:schemas-microsoft-com:vml" xmlns:wp14="http://schemas.microsoft.com/office/word/2010/wordprocessingDrawing" xmlns:wp="http://schemas.openxmlformats.org/drawingml/2006/wordprocessingDrawing" xmlns:w10="urn:schemas-microsoft-com:office:word" xmlns:w="http://schemas.openxmlformats.org/wordprocessingml/2006/main" xmlns:w14="http://schemas.microsoft.com/office/word/2010/wordml" xmlns:w15="http://schemas.microsoft.com/office/word/2012/wordml" xmlns:w16cei="http://schemas.microsoft.com/office/word/2026/wordml/cei" xmlns:w16cex="http://schemas.microsoft.com/office/word/2018/wordml/cex" xmlns:w16cid="http://schemas.microsoft.com/office/word/2016/wordml/cid" xmlns:w16="http://schemas.microsoft.com/office/word/2018/wordml" xmlns:w16du="http://schemas.microsoft.com/office/word/2023/wordml/word16du" xmlns:w16sdtdh="http://schemas.microsoft.com/office/word/2020/wordml/sdtdatahash" xmlns:w16sdtfl="http://schemas.microsoft.com/office/word/2024/wordml/sdtformatlock" xmlns:w16se="http://schemas.microsoft.com/office/word/2015/wordml/symex" xmlns:wpg="http://schemas.microsoft.com/office/word/2010/wordprocessingGroup" xmlns:wpi="http://schemas.microsoft.com/office/word/2010/wordprocessingInk" xmlns:wne="http://schemas.microsoft.com/office/word/2006/wordml" xmlns:wps="http://schemas.microsoft.com/office/word/2010/wordprocessingShape" mc:Ignorable="w14 w15 w16se w16cid w16 w16cex w16sdtdh w16sdtfl w16du wp14">
   <w:body>
     <w:p>
       <w:pPr>
@@ -29,21 +29,7 @@
         <w:rPr>
           <w:rFonts w:ascii="Times New Roman" w:hAnsi="Times New Roman" w:cs="Times New Roman"/>
         </w:rPr>
-        <w:t xml:space="preserve">Predicting undergraduate academic performance stands as a cornerstone of learning analytics and educational data mining. Historically, prediction frameworks relied heavily on static pre-admission parameters, such as high school Grade Point Average (GPA) or standardized examination scores (e.g., SAT/ACT). However, large-scale meta-analytic evidence involving 21,195 students reveals that these static indicators often fail to account for dynamic behavioral shifts that occur as a </w:t>
-      </w:r>
-      <w:proofErr w:type="gramStart"/>
-      <w:r>
-        <w:rPr>
-          <w:rFonts w:ascii="Times New Roman" w:hAnsi="Times New Roman" w:cs="Times New Roman"/>
-        </w:rPr>
-        <w:t>student transitions</w:t>
-      </w:r>
-      <w:proofErr w:type="gramEnd"/>
-      <w:r>
-        <w:rPr>
-          <w:rFonts w:ascii="Times New Roman" w:hAnsi="Times New Roman" w:cs="Times New Roman"/>
-        </w:rPr>
-        <w:t xml:space="preserve"> into the tertiary environment.</w:t>
+        <w:t>Predicting undergraduate academic performance stands as a cornerstone of learning analytics and educational data mining. Historically, prediction frameworks relied heavily on static pre-admission parameters, such as high school Grade Point Average (GPA) or standardized examination scores (e.g., SAT/ACT). However, large-scale meta-analytic evidence involving 21,195 students reveals that these static indicators often fail to account for dynamic behavioral shifts that occur as a student transitions into the tertiary environment.</w:t>
       </w:r>
     </w:p>
     <w:p>
@@ -115,7 +101,7 @@
         <w:rPr>
           <w:rFonts w:ascii="Times New Roman" w:hAnsi="Times New Roman" w:cs="Times New Roman"/>
         </w:rPr>
-        <w:t>Class attendance has consistently emerged as one of the most powerful behavioral determinants of academic success within higher education literature. In a comprehensive meta-analytic review evaluating various non-cognitive predictors of college grades, class attendance demonstrated an exceptionally strong correlation with both specific course grades ($k = 69$, $N = 21,195$, $\rho = .44$) and overall collegiate cumulative GPA ($k = 33$, $N = 9,243$, $\rho = .41$). This foundational research established that class attendance is a statistically superior predictor of university grades compared to any other known academic behavior, outperforming psychometric measures of study habits, documented study skills, and standardized university admission test metrics. Class attendance explains massive amounts of unique performance variance because it operates as an active, direct behavioral engagement mechanism that remains independent from a student's past scholastic aptitude or high school preparation.</w:t>
+        <w:t>Class attendance has consistently emerged as one of the most powerful behavioral determinants of academic success within higher education literature. In a comprehensive meta-analytic review evaluating various non-cognitive predictors of college grades, class attendance demonstrated an exceptionally strong correlation with both specific course grades (k = 69, N = 21,195, \rho = .44) and overall collegiate cumulative GPA (k = 33, N = 9,243, \rho = .41). This foundational research established that class attendance is a statistically superior predictor of university grades compared to any other known academic behavior, outperforming psychometric measures of study habits, documented study skills, and standardized university admission test metrics. Class attendance explains massive amounts of unique performance variance because it operates as an active, direct behavioral engagement mechanism that remains independent from a student's past scholastic aptitude or high school preparation.</w:t>
       </w:r>
       <w:sdt>
         <w:sdtPr>
@@ -210,21 +196,7 @@
         <w:rPr>
           <w:rFonts w:ascii="Times New Roman" w:hAnsi="Times New Roman" w:cs="Times New Roman"/>
         </w:rPr>
-        <w:t>The sensitivity of student performance to classroom absenteeism is heavily modulated by the structural design and cognitive demands of individual course units. Experimental research utilizing difference-in-differences (</w:t>
-      </w:r>
-      <w:proofErr w:type="spellStart"/>
-      <w:r>
-        <w:rPr>
-          <w:rFonts w:ascii="Times New Roman" w:hAnsi="Times New Roman" w:cs="Times New Roman"/>
-        </w:rPr>
-        <w:t>DiD</w:t>
-      </w:r>
-      <w:proofErr w:type="spellEnd"/>
-      <w:r>
-        <w:rPr>
-          <w:rFonts w:ascii="Times New Roman" w:hAnsi="Times New Roman" w:cs="Times New Roman"/>
-        </w:rPr>
-        <w:t>) methodologies to evaluate structural university attendance policies confirms that implementing mandatory preparation frameworks significantly reduces student absenteeism. Crucially, the resulting increase in attendance directly drives a statistically significant drop in failure rates for highly quantitative and technical modules, whereas purely qualitative modules show a much less pronounced direct sensitivity to raw physical presence. This empirical variation proves that analyzing attendance as a flat, aggregated semester average introduces significant predictive noise, validating why a predictive system must model attendance on a rigorous, module-by-module basis.</w:t>
+        <w:t>The sensitivity of student performance to classroom absenteeism is heavily modulated by the structural design and cognitive demands of individual course units. Experimental research utilizing difference-in-differences (DiD) methodologies to evaluate structural university attendance policies confirms that implementing mandatory preparation frameworks significantly reduces student absenteeism. Crucially, the resulting increase in attendance directly drives a statistically significant drop in failure rates for highly quantitative and technical modules, whereas purely qualitative modules show a much less pronounced direct sensitivity to raw physical presence. This empirical variation proves that analyzing attendance as a flat, aggregated semester average introduces significant predictive noise, validating why a predictive system must model attendance on a rigorous, module-by-module basis.</w:t>
       </w:r>
       <w:sdt>
         <w:sdtPr>
@@ -479,21 +451,7 @@
           <w:rFonts w:ascii="Times New Roman" w:hAnsi="Times New Roman" w:cs="Times New Roman"/>
         </w:rPr>
         <w:lastRenderedPageBreak/>
-        <w:t xml:space="preserve">the Sri Lanka Qualifications Framework (SLQF) credit system, which establishes a student workload of 1,500 notional learning hours per academic year. One credit is strictly considered equivalent to 50 notional learning hours for taught or laboratory courses. These notional hours account for direct contact hours with teachers, self-learning time, and time spent preparing assignments or assessments. By analyzing a student's self-directed study hours relative to the total credit </w:t>
-      </w:r>
-      <w:proofErr w:type="gramStart"/>
-      <w:r>
-        <w:rPr>
-          <w:rFonts w:ascii="Times New Roman" w:hAnsi="Times New Roman" w:cs="Times New Roman"/>
-        </w:rPr>
-        <w:t>hours</w:t>
-      </w:r>
-      <w:proofErr w:type="gramEnd"/>
-      <w:r>
-        <w:rPr>
-          <w:rFonts w:ascii="Times New Roman" w:hAnsi="Times New Roman" w:cs="Times New Roman"/>
-        </w:rPr>
-        <w:t xml:space="preserve"> they are registered for in a given semester, PrePal moves away from arbitrary hour boundaries. Instead, the system calculates a personalized, dynamic baseline to determine whether the student's independent learning habits satisfy institutional expectations or fall short, adding rigorous contextual accuracy to its GPA predictions.</w:t>
+        <w:t>the Sri Lanka Qualifications Framework (SLQF) credit system, which establishes a student workload of 1,500 notional learning hours per academic year. One credit is strictly considered equivalent to 50 notional learning hours for taught or laboratory courses. These notional hours account for direct contact hours with teachers, self-learning time, and time spent preparing assignments or assessments. By analyzing a student's self-directed study hours relative to the total credit hours they are registered for in a given semester, PrePal moves away from arbitrary hour boundaries. Instead, the system calculates a personalized, dynamic baseline to determine whether the student's independent learning habits satisfy institutional expectations or fall short, adding rigorous contextual accuracy to its GPA predictions.</w:t>
       </w:r>
     </w:p>
     <w:p>
@@ -656,21 +614,7 @@
         <w:rPr>
           <w:rFonts w:ascii="Times New Roman" w:hAnsi="Times New Roman" w:cs="Times New Roman"/>
         </w:rPr>
-        <w:t xml:space="preserve">Sleep quality cannot be evaluated as an isolated behavioral variable, as it operates in a multi-directional biological and psychological loop. </w:t>
-      </w:r>
-      <w:proofErr w:type="spellStart"/>
-      <w:r>
-        <w:rPr>
-          <w:rFonts w:ascii="Times New Roman" w:hAnsi="Times New Roman" w:cs="Times New Roman"/>
-        </w:rPr>
-        <w:t>Actigraphic</w:t>
-      </w:r>
-      <w:proofErr w:type="spellEnd"/>
-      <w:r>
-        <w:rPr>
-          <w:rFonts w:ascii="Times New Roman" w:hAnsi="Times New Roman" w:cs="Times New Roman"/>
-        </w:rPr>
-        <w:t xml:space="preserve"> and subjective tracking in residential collegiate settings reveals that sleep profiles work in a synchronized loop with subjective well-being and stress tolerance. Reduced sleep quality directly drives a steep decrease in positive affect and amplifies perceived stress, causing a cascading failure in a student’s capability to execute complex cognitive tasks during graded assessments. This interactive framework validates why PrePal models sleep as an interactive cluster alongside psychometric stress scores.</w:t>
+        <w:t>Sleep quality cannot be evaluated as an isolated behavioral variable, as it operates in a multi-directional biological and psychological loop. Actigraphic and subjective tracking in residential collegiate settings reveals that sleep profiles work in a synchronized loop with subjective well-being and stress tolerance. Reduced sleep quality directly drives a steep decrease in positive affect and amplifies perceived stress, causing a cascading failure in a student’s capability to execute complex cognitive tasks during graded assessments. This interactive framework validates why PrePal models sleep as an interactive cluster alongside psychometric stress scores.</w:t>
       </w:r>
       <w:sdt>
         <w:sdtPr>
@@ -894,7 +838,7 @@
         <w:rPr>
           <w:rFonts w:ascii="Times New Roman" w:hAnsi="Times New Roman" w:cs="Times New Roman"/>
         </w:rPr>
-        <w:t>Large-scale validation studies conducted within highly competitive higher education environments confirm that the PSS-10 demonstrates excellent internal consistency, strong construct validity, and reliable test-retest reliability among university undergraduates. By integrating this established psychometric block into the PrePal system interface, qualitative psychological strain is translated into a standardized numerical index ($0$ to $40$). This allows the underlying multiple linear regression engine to model stress variations with true mathematical and behavioral validity.</w:t>
+        <w:t>Large-scale validation studies conducted within highly competitive higher education environments confirm that the PSS-10 demonstrates excellent internal consistency, strong construct validity, and reliable test-retest reliability among university undergraduates. By integrating this established psychometric block into the PrePal system interface, qualitative psychological strain is translated into a standardized numerical index (0 to 40). This allows the underlying multiple linear regression engine to model stress variations with true mathematical and behavioral validity.</w:t>
       </w:r>
       <w:sdt>
         <w:sdtPr>
@@ -1062,10 +1006,10 @@
         <w:tblLook w:val="04A0" w:firstRow="1" w:lastRow="0" w:firstColumn="1" w:lastColumn="0" w:noHBand="0" w:noVBand="1"/>
       </w:tblPr>
       <w:tblGrid>
-        <w:gridCol w:w="1659"/>
-        <w:gridCol w:w="1755"/>
-        <w:gridCol w:w="3115"/>
-        <w:gridCol w:w="2815"/>
+        <w:gridCol w:w="1652"/>
+        <w:gridCol w:w="1735"/>
+        <w:gridCol w:w="3242"/>
+        <w:gridCol w:w="2715"/>
       </w:tblGrid>
       <w:tr>
         <w:trPr>
@@ -1272,19 +1216,11 @@
                 <w:rFonts w:ascii="Times New Roman" w:hAnsi="Times New Roman" w:cs="Times New Roman"/>
               </w:rPr>
             </w:pPr>
-            <w:proofErr w:type="spellStart"/>
-            <w:r>
-              <w:rPr>
-                <w:rFonts w:ascii="Times New Roman" w:hAnsi="Times New Roman" w:cs="Times New Roman"/>
-              </w:rPr>
-              <w:t>Credé</w:t>
-            </w:r>
-            <w:proofErr w:type="spellEnd"/>
-            <w:r>
-              <w:rPr>
-                <w:rFonts w:ascii="Times New Roman" w:hAnsi="Times New Roman" w:cs="Times New Roman"/>
-              </w:rPr>
-              <w:t xml:space="preserve"> et al. (2010)</w:t>
+            <w:r>
+              <w:rPr>
+                <w:rFonts w:ascii="Times New Roman" w:hAnsi="Times New Roman" w:cs="Times New Roman"/>
+              </w:rPr>
+              <w:t>Credé et al. (2010)</w:t>
             </w:r>
           </w:p>
           <w:p>
@@ -1312,21 +1248,7 @@
               <w:rPr>
                 <w:rFonts w:ascii="Times New Roman" w:hAnsi="Times New Roman" w:cs="Times New Roman"/>
               </w:rPr>
-              <w:t xml:space="preserve">Lucey &amp; </w:t>
-            </w:r>
-            <w:proofErr w:type="spellStart"/>
-            <w:r>
-              <w:rPr>
-                <w:rFonts w:ascii="Times New Roman" w:hAnsi="Times New Roman" w:cs="Times New Roman"/>
-              </w:rPr>
-              <w:t>Grydaki</w:t>
-            </w:r>
-            <w:proofErr w:type="spellEnd"/>
-            <w:r>
-              <w:rPr>
-                <w:rFonts w:ascii="Times New Roman" w:hAnsi="Times New Roman" w:cs="Times New Roman"/>
-              </w:rPr>
-              <w:t xml:space="preserve"> (2022)</w:t>
+              <w:t>Lucey &amp; Grydaki (2022)</w:t>
             </w:r>
           </w:p>
         </w:tc>
@@ -1358,8 +1280,94 @@
             <w:r>
               <w:rPr>
                 <w:rFonts w:ascii="Times New Roman" w:hAnsi="Times New Roman" w:cs="Times New Roman"/>
-              </w:rPr>
-              <w:t>Strongest individual predictor of collegiate GPA ($\rho = .41$); holds disproportionately higher predictive value for students in lower mark percentiles.</w:t>
+                <w:b/>
+                <w:bCs/>
+              </w:rPr>
+              <w:t>Positive Impact:</w:t>
+            </w:r>
+            <w:r>
+              <w:rPr>
+                <w:rFonts w:ascii="Times New Roman" w:hAnsi="Times New Roman" w:cs="Times New Roman"/>
+              </w:rPr>
+              <w:t> Strongest behavioral predictor of GPA (</w:t>
+            </w:r>
+            <m:oMath>
+              <m:r>
+                <w:rPr>
+                  <w:rFonts w:ascii="Cambria Math" w:hAnsi="Cambria Math" w:cs="Times New Roman"/>
+                </w:rPr>
+                <m:t>ρ=.41</m:t>
+              </m:r>
+            </m:oMath>
+            <w:r>
+              <w:rPr>
+                <w:rFonts w:ascii="Times New Roman" w:hAnsi="Times New Roman" w:cs="Times New Roman"/>
+              </w:rPr>
+              <w:t>); acts as a vital academic safety net that prevents course failure.</w:t>
+            </w:r>
+            <w:r>
+              <w:rPr>
+                <w:rFonts w:ascii="Times New Roman" w:hAnsi="Times New Roman" w:cs="Times New Roman"/>
+              </w:rPr>
+              <w:br/>
+            </w:r>
+            <w:r>
+              <w:rPr>
+                <w:rFonts w:ascii="Times New Roman" w:hAnsi="Times New Roman" w:cs="Times New Roman"/>
+                <w:b/>
+                <w:bCs/>
+              </w:rPr>
+              <w:t>Negative</w:t>
+            </w:r>
+            <w:r>
+              <w:rPr>
+                <w:rFonts w:ascii="Times New Roman" w:hAnsi="Times New Roman" w:cs="Times New Roman"/>
+                <w:b/>
+                <w:bCs/>
+              </w:rPr>
+              <w:t xml:space="preserve"> </w:t>
+            </w:r>
+            <w:r>
+              <w:rPr>
+                <w:rFonts w:ascii="Times New Roman" w:hAnsi="Times New Roman" w:cs="Times New Roman"/>
+                <w:b/>
+                <w:bCs/>
+              </w:rPr>
+              <w:t>Impact:</w:t>
+            </w:r>
+            <w:r>
+              <w:rPr>
+                <w:rFonts w:ascii="Times New Roman" w:hAnsi="Times New Roman" w:cs="Times New Roman"/>
+              </w:rPr>
+              <w:t> Absenteeism below the 80% institutional threshold causes mandatory module failure (</w:t>
+            </w:r>
+            <m:oMath>
+              <m:r>
+                <w:rPr>
+                  <w:rFonts w:ascii="Cambria Math" w:hAnsi="Cambria Math" w:cs="Times New Roman"/>
+                </w:rPr>
+                <m:t>0.00</m:t>
+              </m:r>
+            </m:oMath>
+            <w:r>
+              <w:rPr>
+                <w:rFonts w:ascii="Times New Roman" w:hAnsi="Times New Roman" w:cs="Times New Roman"/>
+              </w:rPr>
+              <w:t> grade points / </w:t>
+            </w:r>
+            <m:oMath>
+              <m:r>
+                <w:rPr>
+                  <w:rFonts w:ascii="Cambria Math" w:hAnsi="Cambria Math" w:cs="Times New Roman"/>
+                </w:rPr>
+                <m:t>E</m:t>
+              </m:r>
+            </m:oMath>
+            <w:r>
+              <w:rPr>
+                <w:rFonts w:ascii="Times New Roman" w:hAnsi="Times New Roman" w:cs="Times New Roman"/>
+              </w:rPr>
+              <w:t> grade).</w:t>
             </w:r>
           </w:p>
         </w:tc>
@@ -1520,8 +1528,64 @@
             <w:r>
               <w:rPr>
                 <w:rFonts w:ascii="Times New Roman" w:hAnsi="Times New Roman" w:cs="Times New Roman"/>
-              </w:rPr>
-              <w:t>Positive correlation with grades, but interacts strongly with concentration metrics and strategy efficiency.</w:t>
+                <w:b/>
+                <w:bCs/>
+              </w:rPr>
+              <w:t>Positive Impact:</w:t>
+            </w:r>
+            <w:r>
+              <w:rPr>
+                <w:rFonts w:ascii="Times New Roman" w:hAnsi="Times New Roman" w:cs="Times New Roman"/>
+              </w:rPr>
+              <w:t> High weekly independent study volume (</w:t>
+            </w:r>
+            <m:oMath>
+              <m:r>
+                <w:rPr>
+                  <w:rFonts w:ascii="Cambria Math" w:hAnsi="Cambria Math" w:cs="Times New Roman"/>
+                </w:rPr>
+                <m:t>&gt;6</m:t>
+              </m:r>
+            </m:oMath>
+            <w:r>
+              <w:rPr>
+                <w:rFonts w:ascii="Times New Roman" w:hAnsi="Times New Roman" w:cs="Times New Roman"/>
+              </w:rPr>
+              <w:t> hrs/week) consistently elevates final GPA tiers when combined with focus.</w:t>
+            </w:r>
+            <w:r>
+              <w:rPr>
+                <w:rFonts w:ascii="Times New Roman" w:hAnsi="Times New Roman" w:cs="Times New Roman"/>
+              </w:rPr>
+              <w:br/>
+            </w:r>
+            <w:r>
+              <w:rPr>
+                <w:rFonts w:ascii="Times New Roman" w:hAnsi="Times New Roman" w:cs="Times New Roman"/>
+                <w:b/>
+                <w:bCs/>
+              </w:rPr>
+              <w:t>Negative Impact:</w:t>
+            </w:r>
+            <w:r>
+              <w:rPr>
+                <w:rFonts w:ascii="Times New Roman" w:hAnsi="Times New Roman" w:cs="Times New Roman"/>
+              </w:rPr>
+              <w:t> Low study volume (</w:t>
+            </w:r>
+            <m:oMath>
+              <m:r>
+                <w:rPr>
+                  <w:rFonts w:ascii="Cambria Math" w:hAnsi="Cambria Math" w:cs="Times New Roman"/>
+                </w:rPr>
+                <m:t>&lt;4</m:t>
+              </m:r>
+            </m:oMath>
+            <w:r>
+              <w:rPr>
+                <w:rFonts w:ascii="Times New Roman" w:hAnsi="Times New Roman" w:cs="Times New Roman"/>
+              </w:rPr>
+              <w:t> hrs/week) fails to meet passing thresholds; unfocused hours yield diminishing returns.</w:t>
             </w:r>
           </w:p>
         </w:tc>
@@ -1646,19 +1710,12 @@
                 <w:rFonts w:ascii="Times New Roman" w:hAnsi="Times New Roman" w:cs="Times New Roman"/>
               </w:rPr>
             </w:pPr>
-            <w:proofErr w:type="spellStart"/>
-            <w:r>
-              <w:rPr>
-                <w:rFonts w:ascii="Times New Roman" w:hAnsi="Times New Roman" w:cs="Times New Roman"/>
-              </w:rPr>
-              <w:t>Suardiaz</w:t>
-            </w:r>
-            <w:proofErr w:type="spellEnd"/>
-            <w:r>
-              <w:rPr>
-                <w:rFonts w:ascii="Times New Roman" w:hAnsi="Times New Roman" w:cs="Times New Roman"/>
-              </w:rPr>
-              <w:t>-Muro et al. (2023)</w:t>
+            <w:r>
+              <w:rPr>
+                <w:rFonts w:ascii="Times New Roman" w:hAnsi="Times New Roman" w:cs="Times New Roman"/>
+              </w:rPr>
+              <w:lastRenderedPageBreak/>
+              <w:t>Suardiaz-Muro et al. (2023)</w:t>
             </w:r>
           </w:p>
         </w:tc>
@@ -1684,13 +1741,94 @@
             <w:pPr>
               <w:rPr>
                 <w:rFonts w:ascii="Times New Roman" w:hAnsi="Times New Roman" w:cs="Times New Roman"/>
+                <w:b/>
+                <w:bCs/>
               </w:rPr>
             </w:pPr>
             <w:r>
               <w:rPr>
                 <w:rFonts w:ascii="Times New Roman" w:hAnsi="Times New Roman" w:cs="Times New Roman"/>
-              </w:rPr>
-              <w:t>Clinically poor sleepers face significantly depressed mean GPAs ($2.92 \pm 1.09$) and degraded memory consolidation.</w:t>
+                <w:b/>
+                <w:bCs/>
+              </w:rPr>
+              <w:lastRenderedPageBreak/>
+              <w:t>Positive Impact:</w:t>
+            </w:r>
+            <w:r>
+              <w:rPr>
+                <w:rFonts w:ascii="Times New Roman" w:hAnsi="Times New Roman" w:cs="Times New Roman"/>
+              </w:rPr>
+              <w:t> Good sleepers (6–8 hrs/night) exhibit optimal memory consolidation and significantly higher GPA distributions.</w:t>
+            </w:r>
+            <w:r>
+              <w:rPr>
+                <w:rFonts w:ascii="Times New Roman" w:hAnsi="Times New Roman" w:cs="Times New Roman"/>
+              </w:rPr>
+              <w:br/>
+            </w:r>
+          </w:p>
+          <w:p>
+            <w:pPr>
+              <w:rPr>
+                <w:rFonts w:ascii="Times New Roman" w:hAnsi="Times New Roman" w:cs="Times New Roman"/>
+              </w:rPr>
+            </w:pPr>
+            <w:r>
+              <w:rPr>
+                <w:rFonts w:ascii="Times New Roman" w:hAnsi="Times New Roman" w:cs="Times New Roman"/>
+                <w:b/>
+                <w:bCs/>
+              </w:rPr>
+              <w:lastRenderedPageBreak/>
+              <w:t>Negative Impact:</w:t>
+            </w:r>
+            <w:r>
+              <w:rPr>
+                <w:rFonts w:ascii="Times New Roman" w:hAnsi="Times New Roman" w:cs="Times New Roman"/>
+              </w:rPr>
+              <w:t> Poor sleepers (</w:t>
+            </w:r>
+            <m:oMath>
+              <m:r>
+                <w:rPr>
+                  <w:rFonts w:ascii="Cambria Math" w:hAnsi="Cambria Math" w:cs="Times New Roman"/>
+                </w:rPr>
+                <m:t>&lt;5</m:t>
+              </m:r>
+            </m:oMath>
+            <w:r>
+              <w:rPr>
+                <w:rFonts w:ascii="Times New Roman" w:hAnsi="Times New Roman" w:cs="Times New Roman"/>
+              </w:rPr>
+              <w:t> hrs/night) suffer a severe statistical drop in cumulative GPA (</w:t>
+            </w:r>
+            <m:oMath>
+              <m:r>
+                <w:rPr>
+                  <w:rFonts w:ascii="Cambria Math" w:hAnsi="Cambria Math" w:cs="Times New Roman"/>
+                </w:rPr>
+                <m:t>2.92±1.09</m:t>
+              </m:r>
+            </m:oMath>
+            <w:r>
+              <w:rPr>
+                <w:rFonts w:ascii="Times New Roman" w:hAnsi="Times New Roman" w:cs="Times New Roman"/>
+              </w:rPr>
+              <w:t>, </w:t>
+            </w:r>
+            <m:oMath>
+              <m:r>
+                <w:rPr>
+                  <w:rFonts w:ascii="Cambria Math" w:hAnsi="Cambria Math" w:cs="Times New Roman"/>
+                </w:rPr>
+                <m:t>p&lt;.0001</m:t>
+              </m:r>
+            </m:oMath>
+            <w:r>
+              <w:rPr>
+                <w:rFonts w:ascii="Times New Roman" w:hAnsi="Times New Roman" w:cs="Times New Roman"/>
+              </w:rPr>
+              <w:t>).</w:t>
             </w:r>
           </w:p>
         </w:tc>
@@ -1722,6 +1860,7 @@
               <w:rPr>
                 <w:rFonts w:ascii="Times New Roman" w:hAnsi="Times New Roman" w:cs="Times New Roman"/>
               </w:rPr>
+              <w:lastRenderedPageBreak/>
               <w:t>Evaluated via interaction vectors combining overnight duration consistency with physiological strain indicators.</w:t>
             </w:r>
           </w:p>
@@ -1819,36 +1958,7 @@
               <w:rPr>
                 <w:rFonts w:ascii="Times New Roman" w:hAnsi="Times New Roman" w:cs="Times New Roman"/>
               </w:rPr>
-              <w:lastRenderedPageBreak/>
-              <w:t xml:space="preserve">Yılmaz </w:t>
-            </w:r>
-            <w:proofErr w:type="spellStart"/>
-            <w:r>
-              <w:rPr>
-                <w:rFonts w:ascii="Times New Roman" w:hAnsi="Times New Roman" w:cs="Times New Roman"/>
-              </w:rPr>
-              <w:t>Koğar</w:t>
-            </w:r>
-            <w:proofErr w:type="spellEnd"/>
-            <w:r>
-              <w:rPr>
-                <w:rFonts w:ascii="Times New Roman" w:hAnsi="Times New Roman" w:cs="Times New Roman"/>
-              </w:rPr>
-              <w:t xml:space="preserve"> &amp; </w:t>
-            </w:r>
-            <w:proofErr w:type="spellStart"/>
-            <w:r>
-              <w:rPr>
-                <w:rFonts w:ascii="Times New Roman" w:hAnsi="Times New Roman" w:cs="Times New Roman"/>
-              </w:rPr>
-              <w:t>Koğar</w:t>
-            </w:r>
-            <w:proofErr w:type="spellEnd"/>
-            <w:r>
-              <w:rPr>
-                <w:rFonts w:ascii="Times New Roman" w:hAnsi="Times New Roman" w:cs="Times New Roman"/>
-              </w:rPr>
-              <w:t xml:space="preserve"> (2024)</w:t>
+              <w:t>Yılmaz Koğar &amp; Koğar (2024)</w:t>
             </w:r>
           </w:p>
         </w:tc>
@@ -1879,9 +1989,50 @@
             <w:r>
               <w:rPr>
                 <w:rFonts w:ascii="Times New Roman" w:hAnsi="Times New Roman" w:cs="Times New Roman"/>
-              </w:rPr>
-              <w:lastRenderedPageBreak/>
-              <w:t>Directly degrades cumulative performance and triggers working memory capacity deficits.</w:t>
+                <w:b/>
+                <w:bCs/>
+              </w:rPr>
+              <w:t>Positive Impact:</w:t>
+            </w:r>
+            <w:r>
+              <w:rPr>
+                <w:rFonts w:ascii="Times New Roman" w:hAnsi="Times New Roman" w:cs="Times New Roman"/>
+              </w:rPr>
+              <w:t> High perceived self-efficacy and coping confidence promote academic resilience and higher GPA achievement.</w:t>
+            </w:r>
+            <w:r>
+              <w:rPr>
+                <w:rFonts w:ascii="Times New Roman" w:hAnsi="Times New Roman" w:cs="Times New Roman"/>
+              </w:rPr>
+              <w:br/>
+            </w:r>
+            <w:r>
+              <w:rPr>
+                <w:rFonts w:ascii="Times New Roman" w:hAnsi="Times New Roman" w:cs="Times New Roman"/>
+                <w:b/>
+                <w:bCs/>
+              </w:rPr>
+              <w:t>Negative Impact:</w:t>
+            </w:r>
+            <w:r>
+              <w:rPr>
+                <w:rFonts w:ascii="Times New Roman" w:hAnsi="Times New Roman" w:cs="Times New Roman"/>
+              </w:rPr>
+              <w:t> Elevated perceived helplessness triggers Working Memory Capacity Drain, statistically degrading GPA (</w:t>
+            </w:r>
+            <m:oMath>
+              <m:r>
+                <w:rPr>
+                  <w:rFonts w:ascii="Cambria Math" w:hAnsi="Cambria Math" w:cs="Times New Roman"/>
+                </w:rPr>
+                <m:t>p&lt;.01</m:t>
+              </m:r>
+            </m:oMath>
+            <w:r>
+              <w:rPr>
+                <w:rFonts w:ascii="Times New Roman" w:hAnsi="Times New Roman" w:cs="Times New Roman"/>
+              </w:rPr>
+              <w:t>).</w:t>
             </w:r>
           </w:p>
         </w:tc>
@@ -1913,14 +2064,7 @@
               <w:rPr>
                 <w:rFonts w:ascii="Times New Roman" w:hAnsi="Times New Roman" w:cs="Times New Roman"/>
               </w:rPr>
-              <w:t xml:space="preserve">Quantified through a psychometrically validated, embedded short-form Perceived </w:t>
-            </w:r>
-            <w:r>
-              <w:rPr>
-                <w:rFonts w:ascii="Times New Roman" w:hAnsi="Times New Roman" w:cs="Times New Roman"/>
-              </w:rPr>
-              <w:lastRenderedPageBreak/>
-              <w:t>Stress Scale (PSS-10) questionnaire.</w:t>
+              <w:t>Quantified through a psychometrically validated, embedded short-form Perceived Stress Scale (PSS-10) questionnaire.</w:t>
             </w:r>
           </w:p>
         </w:tc>
@@ -1954,21 +2098,7 @@
         <w:rPr>
           <w:rFonts w:ascii="Times New Roman" w:hAnsi="Times New Roman" w:cs="Times New Roman"/>
         </w:rPr>
-        <w:t xml:space="preserve">To validate these global published findings within our localized academic ecosystem, a field survey was executed targeting undergraduate students within the Saegis Campus Bachelor of Information Technology (BIT) program. The collected empirical responses confirm that the international behavioral trends documented by </w:t>
-      </w:r>
-      <w:proofErr w:type="spellStart"/>
-      <w:r>
-        <w:rPr>
-          <w:rFonts w:ascii="Times New Roman" w:hAnsi="Times New Roman" w:cs="Times New Roman"/>
-        </w:rPr>
-        <w:t>Credé</w:t>
-      </w:r>
-      <w:proofErr w:type="spellEnd"/>
-      <w:r>
-        <w:rPr>
-          <w:rFonts w:ascii="Times New Roman" w:hAnsi="Times New Roman" w:cs="Times New Roman"/>
-        </w:rPr>
-        <w:t xml:space="preserve"> et al. (2010) and Cohen et al. (1983) map directly onto the Saegis student batch. </w:t>
+        <w:t xml:space="preserve">To validate these global published findings within our localized academic ecosystem, a field survey was executed targeting undergraduate students within the Saegis Campus Bachelor of Information Technology (BIT) program. The collected empirical responses confirm that the international behavioral trends documented by Credé et al. (2010) and Cohen et al. (1983) map directly onto the Saegis student batch. </w:t>
       </w:r>
     </w:p>
     <w:p>
@@ -1994,49 +2124,7 @@
         <w:rPr>
           <w:rFonts w:ascii="Times New Roman" w:hAnsi="Times New Roman" w:cs="Times New Roman"/>
         </w:rPr>
-        <w:t xml:space="preserve"> tier ($\</w:t>
-      </w:r>
-      <w:proofErr w:type="spellStart"/>
-      <w:r>
-        <w:rPr>
-          <w:rFonts w:ascii="Times New Roman" w:hAnsi="Times New Roman" w:cs="Times New Roman"/>
-        </w:rPr>
-        <w:t>ge</w:t>
-      </w:r>
-      <w:proofErr w:type="spellEnd"/>
-      <w:r>
-        <w:rPr>
-          <w:rFonts w:ascii="Times New Roman" w:hAnsi="Times New Roman" w:cs="Times New Roman"/>
-        </w:rPr>
-        <w:t xml:space="preserve"> 3.70$) consistently displayed an optimized interaction loop: high module attendance ($\</w:t>
-      </w:r>
-      <w:proofErr w:type="spellStart"/>
-      <w:r>
-        <w:rPr>
-          <w:rFonts w:ascii="Times New Roman" w:hAnsi="Times New Roman" w:cs="Times New Roman"/>
-        </w:rPr>
-        <w:t>ge</w:t>
-      </w:r>
-      <w:proofErr w:type="spellEnd"/>
-      <w:r>
-        <w:rPr>
-          <w:rFonts w:ascii="Times New Roman" w:hAnsi="Times New Roman" w:cs="Times New Roman"/>
-        </w:rPr>
-        <w:t xml:space="preserve"> 90\%$), balanced study structures matching the SLQF weekly notional learning limits, consistent sleep durations of 6–7 hours, and low-risk psychometric profiles on the embedded PSS-10 scale. Conversely, students experiencing academic jeopardy correlated tightly with high chronic stress scores and attendance drops below the 80% boundary. This localized alignment provides complete empirical and institutional justification for the selection of these four exclusive features within </w:t>
-      </w:r>
-      <w:proofErr w:type="spellStart"/>
-      <w:r>
-        <w:rPr>
-          <w:rFonts w:ascii="Times New Roman" w:hAnsi="Times New Roman" w:cs="Times New Roman"/>
-        </w:rPr>
-        <w:t>PrePal's</w:t>
-      </w:r>
-      <w:proofErr w:type="spellEnd"/>
-      <w:r>
-        <w:rPr>
-          <w:rFonts w:ascii="Times New Roman" w:hAnsi="Times New Roman" w:cs="Times New Roman"/>
-        </w:rPr>
-        <w:t xml:space="preserve"> machine learning infrastructure.</w:t>
+        <w:t xml:space="preserve"> tier ($\ge 3.70$) consistently displayed an optimized interaction loop: high module attendance ($\ge 90\%$), balanced study structures matching the SLQF weekly notional learning limits, consistent sleep durations of 6–7 hours, and low-risk psychometric profiles on the embedded PSS-10 scale. Conversely, students experiencing academic jeopardy correlated tightly with high chronic stress scores and attendance drops below the 80% boundary. This localized alignment provides complete empirical and institutional justification for the selection of these four exclusive features within PrePal's machine learning infrastructure.</w:t>
       </w:r>
     </w:p>
     <w:p>
@@ -2091,39 +2179,7 @@
               <w:color w:val="000000"/>
             </w:rPr>
             <w:tab/>
-            <w:t xml:space="preserve">M. </w:t>
-          </w:r>
-          <w:proofErr w:type="spellStart"/>
-          <w:r>
-            <w:rPr>
-              <w:rFonts w:ascii="Times New Roman" w:eastAsia="Times New Roman" w:hAnsi="Times New Roman" w:cs="Times New Roman"/>
-              <w:color w:val="000000"/>
-            </w:rPr>
-            <w:t>Credé</w:t>
-          </w:r>
-          <w:proofErr w:type="spellEnd"/>
-          <w:r>
-            <w:rPr>
-              <w:rFonts w:ascii="Times New Roman" w:eastAsia="Times New Roman" w:hAnsi="Times New Roman" w:cs="Times New Roman"/>
-              <w:color w:val="000000"/>
-            </w:rPr>
-            <w:t xml:space="preserve">, S. G. Roch, and U. M. </w:t>
-          </w:r>
-          <w:proofErr w:type="spellStart"/>
-          <w:r>
-            <w:rPr>
-              <w:rFonts w:ascii="Times New Roman" w:eastAsia="Times New Roman" w:hAnsi="Times New Roman" w:cs="Times New Roman"/>
-              <w:color w:val="000000"/>
-            </w:rPr>
-            <w:t>Kieszczynka</w:t>
-          </w:r>
-          <w:proofErr w:type="spellEnd"/>
-          <w:r>
-            <w:rPr>
-              <w:rFonts w:ascii="Times New Roman" w:eastAsia="Times New Roman" w:hAnsi="Times New Roman" w:cs="Times New Roman"/>
-              <w:color w:val="000000"/>
-            </w:rPr>
-            <w:t xml:space="preserve">, “Class attendance in college: A meta-analytic review of the relationship of class attendance with grades and student characteristics,” 2010, </w:t>
+            <w:t xml:space="preserve">M. Credé, S. G. Roch, and U. M. Kieszczynka, “Class attendance in college: A meta-analytic review of the relationship of class attendance with grades and student characteristics,” 2010, </w:t>
           </w:r>
           <w:r>
             <w:rPr>
@@ -2139,23 +2195,7 @@
               <w:rFonts w:ascii="Times New Roman" w:eastAsia="Times New Roman" w:hAnsi="Times New Roman" w:cs="Times New Roman"/>
               <w:color w:val="000000"/>
             </w:rPr>
-            <w:t xml:space="preserve"> </w:t>
-          </w:r>
-          <w:proofErr w:type="spellStart"/>
-          <w:r>
-            <w:rPr>
-              <w:rFonts w:ascii="Times New Roman" w:eastAsia="Times New Roman" w:hAnsi="Times New Roman" w:cs="Times New Roman"/>
-              <w:color w:val="000000"/>
-            </w:rPr>
-            <w:t>doi</w:t>
-          </w:r>
-          <w:proofErr w:type="spellEnd"/>
-          <w:r>
-            <w:rPr>
-              <w:rFonts w:ascii="Times New Roman" w:eastAsia="Times New Roman" w:hAnsi="Times New Roman" w:cs="Times New Roman"/>
-              <w:color w:val="000000"/>
-            </w:rPr>
-            <w:t>: 10.3102/0034654310362998.</w:t>
+            <w:t xml:space="preserve"> doi: 10.3102/0034654310362998.</w:t>
           </w:r>
         </w:p>
         <w:p>
@@ -2198,23 +2238,7 @@
               <w:rFonts w:ascii="Times New Roman" w:eastAsia="Times New Roman" w:hAnsi="Times New Roman" w:cs="Times New Roman"/>
               <w:color w:val="000000"/>
             </w:rPr>
-            <w:t xml:space="preserve">, vol. 15, no. 4, pp. 371–390, 2020, </w:t>
-          </w:r>
-          <w:proofErr w:type="spellStart"/>
-          <w:r>
-            <w:rPr>
-              <w:rFonts w:ascii="Times New Roman" w:eastAsia="Times New Roman" w:hAnsi="Times New Roman" w:cs="Times New Roman"/>
-              <w:color w:val="000000"/>
-            </w:rPr>
-            <w:t>doi</w:t>
-          </w:r>
-          <w:proofErr w:type="spellEnd"/>
-          <w:r>
-            <w:rPr>
-              <w:rFonts w:ascii="Times New Roman" w:eastAsia="Times New Roman" w:hAnsi="Times New Roman" w:cs="Times New Roman"/>
-              <w:color w:val="000000"/>
-            </w:rPr>
-            <w:t>: 10.1177/1745499920958855.</w:t>
+            <w:t>, vol. 15, no. 4, pp. 371–390, 2020, doi: 10.1177/1745499920958855.</w:t>
           </w:r>
         </w:p>
         <w:p>
@@ -2257,23 +2281,7 @@
               <w:rFonts w:ascii="Times New Roman" w:eastAsia="Times New Roman" w:hAnsi="Times New Roman" w:cs="Times New Roman"/>
               <w:color w:val="000000"/>
             </w:rPr>
-            <w:t xml:space="preserve">, vol. 70, no. 2, pp. 180–199, May 2023, </w:t>
-          </w:r>
-          <w:proofErr w:type="spellStart"/>
-          <w:r>
-            <w:rPr>
-              <w:rFonts w:ascii="Times New Roman" w:eastAsia="Times New Roman" w:hAnsi="Times New Roman" w:cs="Times New Roman"/>
-              <w:color w:val="000000"/>
-            </w:rPr>
-            <w:t>doi</w:t>
-          </w:r>
-          <w:proofErr w:type="spellEnd"/>
-          <w:r>
-            <w:rPr>
-              <w:rFonts w:ascii="Times New Roman" w:eastAsia="Times New Roman" w:hAnsi="Times New Roman" w:cs="Times New Roman"/>
-              <w:color w:val="000000"/>
-            </w:rPr>
-            <w:t>: 10.1111/sjpe.12334.</w:t>
+            <w:t>, vol. 70, no. 2, pp. 180–199, May 2023, doi: 10.1111/sjpe.12334.</w:t>
           </w:r>
         </w:p>
         <w:p>
@@ -2309,56 +2317,14 @@
               <w:iCs/>
               <w:color w:val="000000"/>
             </w:rPr>
-            <w:t xml:space="preserve">International </w:t>
-          </w:r>
-          <w:r>
-            <w:rPr>
-              <w:rFonts w:ascii="Times New Roman" w:eastAsia="Times New Roman" w:hAnsi="Times New Roman" w:cs="Times New Roman"/>
-              <w:i/>
-              <w:iCs/>
-              <w:color w:val="000000"/>
-            </w:rPr>
-            <w:lastRenderedPageBreak/>
-            <w:t>Journal of Multidisciplinary Research and Growth Evaluation</w:t>
-          </w:r>
-          <w:r>
-            <w:rPr>
-              <w:rFonts w:ascii="Times New Roman" w:eastAsia="Times New Roman" w:hAnsi="Times New Roman" w:cs="Times New Roman"/>
-              <w:color w:val="000000"/>
-            </w:rPr>
-            <w:t xml:space="preserve">, vol. 5, no. 3, pp. 720–728, 2024, </w:t>
-          </w:r>
-          <w:proofErr w:type="spellStart"/>
-          <w:r>
-            <w:rPr>
-              <w:rFonts w:ascii="Times New Roman" w:eastAsia="Times New Roman" w:hAnsi="Times New Roman" w:cs="Times New Roman"/>
-              <w:color w:val="000000"/>
-            </w:rPr>
-            <w:t>doi</w:t>
-          </w:r>
-          <w:proofErr w:type="spellEnd"/>
-          <w:r>
-            <w:rPr>
-              <w:rFonts w:ascii="Times New Roman" w:eastAsia="Times New Roman" w:hAnsi="Times New Roman" w:cs="Times New Roman"/>
-              <w:color w:val="000000"/>
-            </w:rPr>
-            <w:t>: 10.54660</w:t>
-          </w:r>
-          <w:proofErr w:type="gramStart"/>
-          <w:r>
-            <w:rPr>
-              <w:rFonts w:ascii="Times New Roman" w:eastAsia="Times New Roman" w:hAnsi="Times New Roman" w:cs="Times New Roman"/>
-              <w:color w:val="000000"/>
-            </w:rPr>
-            <w:t>/.ijmrge</w:t>
-          </w:r>
-          <w:proofErr w:type="gramEnd"/>
-          <w:r>
-            <w:rPr>
-              <w:rFonts w:ascii="Times New Roman" w:eastAsia="Times New Roman" w:hAnsi="Times New Roman" w:cs="Times New Roman"/>
-              <w:color w:val="000000"/>
-            </w:rPr>
-            <w:t>.2024.5.3.720-728.</w:t>
+            <w:t>International Journal of Multidisciplinary Research and Growth Evaluation</w:t>
+          </w:r>
+          <w:r>
+            <w:rPr>
+              <w:rFonts w:ascii="Times New Roman" w:eastAsia="Times New Roman" w:hAnsi="Times New Roman" w:cs="Times New Roman"/>
+              <w:color w:val="000000"/>
+            </w:rPr>
+            <w:t>, vol. 5, no. 3, pp. 720–728, 2024, doi: 10.54660/.ijmrge.2024.5.3.720-728.</w:t>
           </w:r>
         </w:p>
         <w:p>
@@ -2401,23 +2367,7 @@
               <w:rFonts w:ascii="Times New Roman" w:eastAsia="Times New Roman" w:hAnsi="Times New Roman" w:cs="Times New Roman"/>
               <w:color w:val="000000"/>
             </w:rPr>
-            <w:t xml:space="preserve">, vol. 95, no. 2, pp. 405–420, Jun. 2025, </w:t>
-          </w:r>
-          <w:proofErr w:type="spellStart"/>
-          <w:r>
-            <w:rPr>
-              <w:rFonts w:ascii="Times New Roman" w:eastAsia="Times New Roman" w:hAnsi="Times New Roman" w:cs="Times New Roman"/>
-              <w:color w:val="000000"/>
-            </w:rPr>
-            <w:t>doi</w:t>
-          </w:r>
-          <w:proofErr w:type="spellEnd"/>
-          <w:r>
-            <w:rPr>
-              <w:rFonts w:ascii="Times New Roman" w:eastAsia="Times New Roman" w:hAnsi="Times New Roman" w:cs="Times New Roman"/>
-              <w:color w:val="000000"/>
-            </w:rPr>
-            <w:t>: 10.1111/bjep.12725.</w:t>
+            <w:t>, vol. 95, no. 2, pp. 405–420, Jun. 2025, doi: 10.1111/bjep.12725.</w:t>
           </w:r>
         </w:p>
         <w:p>
@@ -2444,23 +2394,7 @@
               <w:color w:val="000000"/>
             </w:rPr>
             <w:tab/>
-            <w:t xml:space="preserve">E. M. Walck-Shannon, S. F. Rowell, and R. F. Frey, “To what extent do study habits relate to </w:t>
-          </w:r>
-          <w:proofErr w:type="gramStart"/>
-          <w:r>
-            <w:rPr>
-              <w:rFonts w:ascii="Times New Roman" w:eastAsia="Times New Roman" w:hAnsi="Times New Roman" w:cs="Times New Roman"/>
-              <w:color w:val="000000"/>
-            </w:rPr>
-            <w:t>performance?,</w:t>
-          </w:r>
-          <w:proofErr w:type="gramEnd"/>
-          <w:r>
-            <w:rPr>
-              <w:rFonts w:ascii="Times New Roman" w:eastAsia="Times New Roman" w:hAnsi="Times New Roman" w:cs="Times New Roman"/>
-              <w:color w:val="000000"/>
-            </w:rPr>
-            <w:t xml:space="preserve">” </w:t>
+            <w:t xml:space="preserve">E. M. Walck-Shannon, S. F. Rowell, and R. F. Frey, “To what extent do study habits relate to performance?,” </w:t>
           </w:r>
           <w:r>
             <w:rPr>
@@ -2476,23 +2410,7 @@
               <w:rFonts w:ascii="Times New Roman" w:eastAsia="Times New Roman" w:hAnsi="Times New Roman" w:cs="Times New Roman"/>
               <w:color w:val="000000"/>
             </w:rPr>
-            <w:t xml:space="preserve">, vol. 20, no. 1, pp. 1–15, Mar. 2021, </w:t>
-          </w:r>
-          <w:proofErr w:type="spellStart"/>
-          <w:r>
-            <w:rPr>
-              <w:rFonts w:ascii="Times New Roman" w:eastAsia="Times New Roman" w:hAnsi="Times New Roman" w:cs="Times New Roman"/>
-              <w:color w:val="000000"/>
-            </w:rPr>
-            <w:t>doi</w:t>
-          </w:r>
-          <w:proofErr w:type="spellEnd"/>
-          <w:r>
-            <w:rPr>
-              <w:rFonts w:ascii="Times New Roman" w:eastAsia="Times New Roman" w:hAnsi="Times New Roman" w:cs="Times New Roman"/>
-              <w:color w:val="000000"/>
-            </w:rPr>
-            <w:t>: 10.1187/cbe.20-05-0091.</w:t>
+            <w:t>, vol. 20, no. 1, pp. 1–15, Mar. 2021, doi: 10.1187/cbe.20-05-0091.</w:t>
           </w:r>
         </w:p>
         <w:p>
@@ -2521,7 +2439,6 @@
             <w:tab/>
             <w:t xml:space="preserve">G. Maheshwari and F. Shaukat, “Impact of Poor Sleep Quality on the Academic Performance of Medical Students,” </w:t>
           </w:r>
-          <w:proofErr w:type="spellStart"/>
           <w:r>
             <w:rPr>
               <w:rFonts w:ascii="Times New Roman" w:eastAsia="Times New Roman" w:hAnsi="Times New Roman" w:cs="Times New Roman"/>
@@ -2531,29 +2448,12 @@
             </w:rPr>
             <w:t>Cureus</w:t>
           </w:r>
-          <w:proofErr w:type="spellEnd"/>
-          <w:r>
-            <w:rPr>
-              <w:rFonts w:ascii="Times New Roman" w:eastAsia="Times New Roman" w:hAnsi="Times New Roman" w:cs="Times New Roman"/>
-              <w:color w:val="000000"/>
-            </w:rPr>
-            <w:t xml:space="preserve">, Apr. 2019, </w:t>
-          </w:r>
-          <w:proofErr w:type="spellStart"/>
-          <w:r>
-            <w:rPr>
-              <w:rFonts w:ascii="Times New Roman" w:eastAsia="Times New Roman" w:hAnsi="Times New Roman" w:cs="Times New Roman"/>
-              <w:color w:val="000000"/>
-            </w:rPr>
-            <w:t>doi</w:t>
-          </w:r>
-          <w:proofErr w:type="spellEnd"/>
-          <w:r>
-            <w:rPr>
-              <w:rFonts w:ascii="Times New Roman" w:eastAsia="Times New Roman" w:hAnsi="Times New Roman" w:cs="Times New Roman"/>
-              <w:color w:val="000000"/>
-            </w:rPr>
-            <w:t>: 10.7759/cureus.4357.</w:t>
+          <w:r>
+            <w:rPr>
+              <w:rFonts w:ascii="Times New Roman" w:eastAsia="Times New Roman" w:hAnsi="Times New Roman" w:cs="Times New Roman"/>
+              <w:color w:val="000000"/>
+            </w:rPr>
+            <w:t>, Apr. 2019, doi: 10.7759/cureus.4357.</w:t>
           </w:r>
         </w:p>
         <w:p>
@@ -2580,39 +2480,7 @@
               <w:color w:val="000000"/>
             </w:rPr>
             <w:tab/>
-            <w:t xml:space="preserve">M. A. Armand, F. </w:t>
-          </w:r>
-          <w:proofErr w:type="spellStart"/>
-          <w:r>
-            <w:rPr>
-              <w:rFonts w:ascii="Times New Roman" w:eastAsia="Times New Roman" w:hAnsi="Times New Roman" w:cs="Times New Roman"/>
-              <w:color w:val="000000"/>
-            </w:rPr>
-            <w:t>Biassoni</w:t>
-          </w:r>
-          <w:proofErr w:type="spellEnd"/>
-          <w:r>
-            <w:rPr>
-              <w:rFonts w:ascii="Times New Roman" w:eastAsia="Times New Roman" w:hAnsi="Times New Roman" w:cs="Times New Roman"/>
-              <w:color w:val="000000"/>
-            </w:rPr>
-            <w:t xml:space="preserve">, and A. </w:t>
-          </w:r>
-          <w:proofErr w:type="spellStart"/>
-          <w:r>
-            <w:rPr>
-              <w:rFonts w:ascii="Times New Roman" w:eastAsia="Times New Roman" w:hAnsi="Times New Roman" w:cs="Times New Roman"/>
-              <w:color w:val="000000"/>
-            </w:rPr>
-            <w:t>Corrias</w:t>
-          </w:r>
-          <w:proofErr w:type="spellEnd"/>
-          <w:r>
-            <w:rPr>
-              <w:rFonts w:ascii="Times New Roman" w:eastAsia="Times New Roman" w:hAnsi="Times New Roman" w:cs="Times New Roman"/>
-              <w:color w:val="000000"/>
-            </w:rPr>
-            <w:t xml:space="preserve">, “Sleep, Well-Being and Academic Performance: A Study in a Singapore Residential College,” </w:t>
+            <w:t xml:space="preserve">M. A. Armand, F. Biassoni, and A. Corrias, “Sleep, Well-Being and Academic Performance: A Study in a Singapore Residential College,” </w:t>
           </w:r>
           <w:r>
             <w:rPr>
@@ -2628,23 +2496,7 @@
               <w:rFonts w:ascii="Times New Roman" w:eastAsia="Times New Roman" w:hAnsi="Times New Roman" w:cs="Times New Roman"/>
               <w:color w:val="000000"/>
             </w:rPr>
-            <w:t xml:space="preserve">, vol. 12, May 2021, </w:t>
-          </w:r>
-          <w:proofErr w:type="spellStart"/>
-          <w:r>
-            <w:rPr>
-              <w:rFonts w:ascii="Times New Roman" w:eastAsia="Times New Roman" w:hAnsi="Times New Roman" w:cs="Times New Roman"/>
-              <w:color w:val="000000"/>
-            </w:rPr>
-            <w:t>doi</w:t>
-          </w:r>
-          <w:proofErr w:type="spellEnd"/>
-          <w:r>
-            <w:rPr>
-              <w:rFonts w:ascii="Times New Roman" w:eastAsia="Times New Roman" w:hAnsi="Times New Roman" w:cs="Times New Roman"/>
-              <w:color w:val="000000"/>
-            </w:rPr>
-            <w:t>: 10.3389/fpsyg.2021.672238.</w:t>
+            <w:t>, vol. 12, May 2021, doi: 10.3389/fpsyg.2021.672238.</w:t>
           </w:r>
         </w:p>
         <w:p>
@@ -2671,25 +2523,8 @@
               <w:color w:val="000000"/>
             </w:rPr>
             <w:tab/>
-            <w:t xml:space="preserve">S. Hassan, N. M Alqahtani, S. M Alshahrani, A. A </w:t>
-          </w:r>
-          <w:proofErr w:type="spellStart"/>
-          <w:r>
-            <w:rPr>
-              <w:rFonts w:ascii="Times New Roman" w:eastAsia="Times New Roman" w:hAnsi="Times New Roman" w:cs="Times New Roman"/>
-              <w:color w:val="000000"/>
-            </w:rPr>
-            <w:t>Alhefzy</w:t>
-          </w:r>
-          <w:proofErr w:type="spellEnd"/>
-          <w:r>
-            <w:rPr>
-              <w:rFonts w:ascii="Times New Roman" w:eastAsia="Times New Roman" w:hAnsi="Times New Roman" w:cs="Times New Roman"/>
-              <w:color w:val="000000"/>
-            </w:rPr>
-            <w:t xml:space="preserve">, O. Alharthi, and M. Alharbi, “Association Between Sleep Quality and Academic Performance Among Undergraduate Medical Health Sciences Students: A Cross-Sectional Study,” </w:t>
-          </w:r>
-          <w:proofErr w:type="spellStart"/>
+            <w:t xml:space="preserve">S. Hassan, N. M Alqahtani, S. M Alshahrani, A. A Alhefzy, O. Alharthi, and M. Alharbi, “Association Between Sleep Quality and Academic Performance Among Undergraduate Medical Health Sciences Students: A Cross-Sectional Study,” </w:t>
+          </w:r>
           <w:r>
             <w:rPr>
               <w:rFonts w:ascii="Times New Roman" w:eastAsia="Times New Roman" w:hAnsi="Times New Roman" w:cs="Times New Roman"/>
@@ -2699,29 +2534,12 @@
             </w:rPr>
             <w:t>Cureus</w:t>
           </w:r>
-          <w:proofErr w:type="spellEnd"/>
-          <w:r>
-            <w:rPr>
-              <w:rFonts w:ascii="Times New Roman" w:eastAsia="Times New Roman" w:hAnsi="Times New Roman" w:cs="Times New Roman"/>
-              <w:color w:val="000000"/>
-            </w:rPr>
-            <w:t xml:space="preserve">, Sep. 2025, </w:t>
-          </w:r>
-          <w:proofErr w:type="spellStart"/>
-          <w:r>
-            <w:rPr>
-              <w:rFonts w:ascii="Times New Roman" w:eastAsia="Times New Roman" w:hAnsi="Times New Roman" w:cs="Times New Roman"/>
-              <w:color w:val="000000"/>
-            </w:rPr>
-            <w:t>doi</w:t>
-          </w:r>
-          <w:proofErr w:type="spellEnd"/>
-          <w:r>
-            <w:rPr>
-              <w:rFonts w:ascii="Times New Roman" w:eastAsia="Times New Roman" w:hAnsi="Times New Roman" w:cs="Times New Roman"/>
-              <w:color w:val="000000"/>
-            </w:rPr>
-            <w:t>: 10.7759/cureus.91548.</w:t>
+          <w:r>
+            <w:rPr>
+              <w:rFonts w:ascii="Times New Roman" w:eastAsia="Times New Roman" w:hAnsi="Times New Roman" w:cs="Times New Roman"/>
+              <w:color w:val="000000"/>
+            </w:rPr>
+            <w:t>, Sep. 2025, doi: 10.7759/cureus.91548.</w:t>
           </w:r>
         </w:p>
         <w:p>
@@ -2748,23 +2566,7 @@
               <w:color w:val="000000"/>
             </w:rPr>
             <w:tab/>
-            <w:t xml:space="preserve">O. Popa-Velea, I. </w:t>
-          </w:r>
-          <w:proofErr w:type="spellStart"/>
-          <w:r>
-            <w:rPr>
-              <w:rFonts w:ascii="Times New Roman" w:eastAsia="Times New Roman" w:hAnsi="Times New Roman" w:cs="Times New Roman"/>
-              <w:color w:val="000000"/>
-            </w:rPr>
-            <w:t>Pîrvan</w:t>
-          </w:r>
-          <w:proofErr w:type="spellEnd"/>
-          <w:r>
-            <w:rPr>
-              <w:rFonts w:ascii="Times New Roman" w:eastAsia="Times New Roman" w:hAnsi="Times New Roman" w:cs="Times New Roman"/>
-              <w:color w:val="000000"/>
-            </w:rPr>
-            <w:t xml:space="preserve">, and L. V. Diaconescu, “The impact of self-efficacy, optimism, resilience and perceived stress on academic performance and its subjective evaluation: A cross-sectional study,” </w:t>
+            <w:t xml:space="preserve">O. Popa-Velea, I. Pîrvan, and L. V. Diaconescu, “The impact of self-efficacy, optimism, resilience and perceived stress on academic performance and its subjective evaluation: A cross-sectional study,” </w:t>
           </w:r>
           <w:r>
             <w:rPr>
@@ -2780,23 +2582,7 @@
               <w:rFonts w:ascii="Times New Roman" w:eastAsia="Times New Roman" w:hAnsi="Times New Roman" w:cs="Times New Roman"/>
               <w:color w:val="000000"/>
             </w:rPr>
-            <w:t xml:space="preserve">, vol. 18, no. 17, Sep. 2021, </w:t>
-          </w:r>
-          <w:proofErr w:type="spellStart"/>
-          <w:r>
-            <w:rPr>
-              <w:rFonts w:ascii="Times New Roman" w:eastAsia="Times New Roman" w:hAnsi="Times New Roman" w:cs="Times New Roman"/>
-              <w:color w:val="000000"/>
-            </w:rPr>
-            <w:t>doi</w:t>
-          </w:r>
-          <w:proofErr w:type="spellEnd"/>
-          <w:r>
-            <w:rPr>
-              <w:rFonts w:ascii="Times New Roman" w:eastAsia="Times New Roman" w:hAnsi="Times New Roman" w:cs="Times New Roman"/>
-              <w:color w:val="000000"/>
-            </w:rPr>
-            <w:t>: 10.3390/ijerph18178911.</w:t>
+            <w:t>, vol. 18, no. 17, Sep. 2021, doi: 10.3390/ijerph18178911.</w:t>
           </w:r>
         </w:p>
         <w:p>
@@ -2823,23 +2609,7 @@
               <w:color w:val="000000"/>
             </w:rPr>
             <w:tab/>
-            <w:t xml:space="preserve">S. Cohen, T. </w:t>
-          </w:r>
-          <w:proofErr w:type="spellStart"/>
-          <w:r>
-            <w:rPr>
-              <w:rFonts w:ascii="Times New Roman" w:eastAsia="Times New Roman" w:hAnsi="Times New Roman" w:cs="Times New Roman"/>
-              <w:color w:val="000000"/>
-            </w:rPr>
-            <w:t>Kamarck</w:t>
-          </w:r>
-          <w:proofErr w:type="spellEnd"/>
-          <w:r>
-            <w:rPr>
-              <w:rFonts w:ascii="Times New Roman" w:eastAsia="Times New Roman" w:hAnsi="Times New Roman" w:cs="Times New Roman"/>
-              <w:color w:val="000000"/>
-            </w:rPr>
-            <w:t>, and R. Mermelstein, “A Global Measure of Perceived Stress,” 1983.</w:t>
+            <w:t>S. Cohen, T. Kamarck, and R. Mermelstein, “A Global Measure of Perceived Stress,” 1983.</w:t>
           </w:r>
         </w:p>
         <w:p>
@@ -2858,6 +2628,7 @@
               <w:rFonts w:ascii="Times New Roman" w:eastAsia="Times New Roman" w:hAnsi="Times New Roman" w:cs="Times New Roman"/>
               <w:color w:val="000000"/>
             </w:rPr>
+            <w:lastRenderedPageBreak/>
             <w:t>[12]</w:t>
           </w:r>
           <w:r>
@@ -2882,23 +2653,7 @@
               <w:rFonts w:ascii="Times New Roman" w:eastAsia="Times New Roman" w:hAnsi="Times New Roman" w:cs="Times New Roman"/>
               <w:color w:val="000000"/>
             </w:rPr>
-            <w:t xml:space="preserve">, vol. 5, no. 1, pp. 251–259, Feb. 2026, </w:t>
-          </w:r>
-          <w:proofErr w:type="spellStart"/>
-          <w:r>
-            <w:rPr>
-              <w:rFonts w:ascii="Times New Roman" w:eastAsia="Times New Roman" w:hAnsi="Times New Roman" w:cs="Times New Roman"/>
-              <w:color w:val="000000"/>
-            </w:rPr>
-            <w:t>doi</w:t>
-          </w:r>
-          <w:proofErr w:type="spellEnd"/>
-          <w:r>
-            <w:rPr>
-              <w:rFonts w:ascii="Times New Roman" w:eastAsia="Times New Roman" w:hAnsi="Times New Roman" w:cs="Times New Roman"/>
-              <w:color w:val="000000"/>
-            </w:rPr>
-            <w:t>: 10.71085/sss.05.01.481.</w:t>
+            <w:t>, vol. 5, no. 1, pp. 251–259, Feb. 2026, doi: 10.71085/sss.05.01.481.</w:t>
           </w:r>
         </w:p>
         <w:p>
@@ -3853,7 +3608,7 @@
 </file>
 
 <file path=word/glossary/document.xml><?xml version="1.0" encoding="utf-8"?>
-<w:glossaryDocument xmlns:wpc="http://schemas.microsoft.com/office/word/2010/wordprocessingCanvas" xmlns:cx="http://schemas.microsoft.com/office/drawing/2014/chartex" xmlns:cx1="http://schemas.microsoft.com/office/drawing/2015/9/8/chartex" xmlns:cx2="http://schemas.microsoft.com/office/drawing/2015/10/21/chartex" xmlns:cx3="http://schemas.microsoft.com/office/drawing/2016/5/9/chartex" xmlns:cx4="http://schemas.microsoft.com/office/drawing/2016/5/10/chartex" xmlns:cx5="http://schemas.microsoft.com/office/drawing/2016/5/11/chartex" xmlns:cx6="http://schemas.microsoft.com/office/drawing/2016/5/12/chartex" xmlns:cx7="http://schemas.microsoft.com/office/drawing/2016/5/13/chartex" xmlns:cx8="http://schemas.microsoft.com/office/drawing/2016/5/14/chartex" xmlns:mc="http://schemas.openxmlformats.org/markup-compatibility/2006" xmlns:aink="http://schemas.microsoft.com/office/drawing/2016/ink" xmlns:am3d="http://schemas.microsoft.com/office/drawing/2017/model3d" xmlns:o="urn:schemas-microsoft-com:office:office" xmlns:oel="http://schemas.microsoft.com/office/2019/extlst" xmlns:r="http://schemas.openxmlformats.org/officeDocument/2006/relationships" xmlns:m="http://schemas.openxmlformats.org/officeDocument/2006/math" xmlns:v="urn:schemas-microsoft-com:vml" xmlns:wp14="http://schemas.microsoft.com/office/word/2010/wordprocessingDrawing" xmlns:wp="http://schemas.openxmlformats.org/drawingml/2006/wordprocessingDrawing" xmlns:w10="urn:schemas-microsoft-com:office:word" xmlns:w="http://schemas.openxmlformats.org/wordprocessingml/2006/main" xmlns:w14="http://schemas.microsoft.com/office/word/2010/wordml" xmlns:w15="http://schemas.microsoft.com/office/word/2012/wordml" xmlns:w16cex="http://schemas.microsoft.com/office/word/2018/wordml/cex" xmlns:w16cid="http://schemas.microsoft.com/office/word/2016/wordml/cid" xmlns:w16="http://schemas.microsoft.com/office/word/2018/wordml" xmlns:w16du="http://schemas.microsoft.com/office/word/2023/wordml/word16du" xmlns:w16sdtdh="http://schemas.microsoft.com/office/word/2020/wordml/sdtdatahash" xmlns:w16sdtfl="http://schemas.microsoft.com/office/word/2024/wordml/sdtformatlock" xmlns:w16se="http://schemas.microsoft.com/office/word/2015/wordml/symex" xmlns:wpg="http://schemas.microsoft.com/office/word/2010/wordprocessingGroup" xmlns:wpi="http://schemas.microsoft.com/office/word/2010/wordprocessingInk" xmlns:wne="http://schemas.microsoft.com/office/word/2006/wordml" xmlns:wps="http://schemas.microsoft.com/office/word/2010/wordprocessingShape" mc:Ignorable="w14 w15 w16se w16cid w16 w16cex w16sdtdh w16sdtfl w16du wp14">
+<w:glossaryDocument xmlns:wpc="http://schemas.microsoft.com/office/word/2010/wordprocessingCanvas" xmlns:cx="http://schemas.microsoft.com/office/drawing/2014/chartex" xmlns:cx1="http://schemas.microsoft.com/office/drawing/2015/9/8/chartex" xmlns:cx2="http://schemas.microsoft.com/office/drawing/2015/10/21/chartex" xmlns:cx3="http://schemas.microsoft.com/office/drawing/2016/5/9/chartex" xmlns:cx4="http://schemas.microsoft.com/office/drawing/2016/5/10/chartex" xmlns:cx5="http://schemas.microsoft.com/office/drawing/2016/5/11/chartex" xmlns:cx6="http://schemas.microsoft.com/office/drawing/2016/5/12/chartex" xmlns:cx7="http://schemas.microsoft.com/office/drawing/2016/5/13/chartex" xmlns:cx8="http://schemas.microsoft.com/office/drawing/2016/5/14/chartex" xmlns:mc="http://schemas.openxmlformats.org/markup-compatibility/2006" xmlns:aink="http://schemas.microsoft.com/office/drawing/2016/ink" xmlns:am3d="http://schemas.microsoft.com/office/drawing/2017/model3d" xmlns:o="urn:schemas-microsoft-com:office:office" xmlns:oel="http://schemas.microsoft.com/office/2019/extlst" xmlns:r="http://schemas.openxmlformats.org/officeDocument/2006/relationships" xmlns:m="http://schemas.openxmlformats.org/officeDocument/2006/math" xmlns:v="urn:schemas-microsoft-com:vml" xmlns:wp14="http://schemas.microsoft.com/office/word/2010/wordprocessingDrawing" xmlns:wp="http://schemas.openxmlformats.org/drawingml/2006/wordprocessingDrawing" xmlns:w10="urn:schemas-microsoft-com:office:word" xmlns:w="http://schemas.openxmlformats.org/wordprocessingml/2006/main" xmlns:w14="http://schemas.microsoft.com/office/word/2010/wordml" xmlns:w15="http://schemas.microsoft.com/office/word/2012/wordml" xmlns:w16cei="http://schemas.microsoft.com/office/word/2026/wordml/cei" xmlns:w16cex="http://schemas.microsoft.com/office/word/2018/wordml/cex" xmlns:w16cid="http://schemas.microsoft.com/office/word/2016/wordml/cid" xmlns:w16="http://schemas.microsoft.com/office/word/2018/wordml" xmlns:w16du="http://schemas.microsoft.com/office/word/2023/wordml/word16du" xmlns:w16sdtdh="http://schemas.microsoft.com/office/word/2020/wordml/sdtdatahash" xmlns:w16sdtfl="http://schemas.microsoft.com/office/word/2024/wordml/sdtformatlock" xmlns:w16se="http://schemas.microsoft.com/office/word/2015/wordml/symex" xmlns:wpg="http://schemas.microsoft.com/office/word/2010/wordprocessingGroup" xmlns:wpi="http://schemas.microsoft.com/office/word/2010/wordprocessingInk" xmlns:wne="http://schemas.microsoft.com/office/word/2006/wordml" xmlns:wps="http://schemas.microsoft.com/office/word/2010/wordprocessingShape" mc:Ignorable="w14 w15 w16se w16cid w16 w16cex w16sdtdh w16sdtfl w16du wp14">
   <w:docParts>
     <w:docPart>
       <w:docPartPr>
@@ -3908,6 +3663,13 @@
     <w:pitch w:val="variable"/>
     <w:sig w:usb0="E4002EFF" w:usb1="C000247B" w:usb2="00000009" w:usb3="00000000" w:csb0="000001FF" w:csb1="00000000"/>
   </w:font>
+  <w:font w:name="Cambria Math">
+    <w:panose1 w:val="02040503050406030204"/>
+    <w:charset w:val="00"/>
+    <w:family w:val="roman"/>
+    <w:pitch w:val="variable"/>
+    <w:sig w:usb0="E00006FF" w:usb1="420024FF" w:usb2="02000000" w:usb3="00000000" w:csb0="0000019F" w:csb1="00000000"/>
+  </w:font>
 </w:fonts>
 </file>
 
@@ -3927,9 +3689,14 @@
   </w:compat>
   <w:rsids>
     <w:rsidRoot w:val="00814F43"/>
+    <w:rsid w:val="000526D0"/>
+    <w:rsid w:val="00126F77"/>
+    <w:rsid w:val="002F407B"/>
     <w:rsid w:val="00814F43"/>
     <w:rsid w:val="008C3ADD"/>
     <w:rsid w:val="0090104D"/>
+    <w:rsid w:val="00B31D1B"/>
+    <w:rsid w:val="00CD320F"/>
   </w:rsids>
   <m:mathPr>
     <m:mathFont m:val="Cambria Math"/>

</xml_diff>